<commit_message>
Fill author (Georgy Bykov) and repository URL in paper + citation
</commit_message>
<xml_diff>
--- a/04_Paper/findex_2025_working_paper.docx
+++ b/04_Paper/findex_2025_working_paper.docx
@@ -24,7 +24,7 @@
     </w:p>
     <w:p>
       <w:pPr>
-        <w:spacing w:after="40" w:before="0"/>
+        <w:spacing w:after="480" w:before="0"/>
         <w:jc w:val="center"/>
       </w:pPr>
       <w:r>
@@ -33,35 +33,7 @@
           <w:i w:val="0"/>
           <w:sz w:val="26"/>
         </w:rPr>
-        <w:t>[Author Name]</w:t>
-      </w:r>
-    </w:p>
-    <w:p>
-      <w:pPr>
-        <w:spacing w:after="40" w:before="0"/>
-        <w:jc w:val="center"/>
-      </w:pPr>
-      <w:r>
-        <w:rPr>
-          <w:b w:val="0"/>
-          <w:i w:val="0"/>
-          <w:sz w:val="24"/>
-        </w:rPr>
-        <w:t>[Affiliation]</w:t>
-      </w:r>
-    </w:p>
-    <w:p>
-      <w:pPr>
-        <w:spacing w:after="480" w:before="0"/>
-        <w:jc w:val="center"/>
-      </w:pPr>
-      <w:r>
-        <w:rPr>
-          <w:b w:val="0"/>
-          <w:i w:val="0"/>
-          <w:sz w:val="22"/>
-        </w:rPr>
-        <w:t>[email@example.com]</w:t>
+        <w:t>Georgy Bykov</w:t>
       </w:r>
     </w:p>
     <w:p>
@@ -169,7 +141,7 @@
           <w:i w:val="0"/>
           <w:sz w:val="22"/>
         </w:rPr>
-        <w:t xml:space="preserve"> [repository URL]</w:t>
+        <w:t xml:space="preserve"> https://github.com/grgbkv/financial-inclusion-findex-2025</w:t>
       </w:r>
     </w:p>
     <w:p>
@@ -3205,7 +3177,7 @@
           <w:i w:val="0"/>
           <w:sz w:val="24"/>
         </w:rPr>
-        <w:t>The Global Findex Database 2025 is published by the World Bank at worldbank.org/globalfindex. All code producing every figure, table and statistic in this paper, together with the analysis notebook, is available at [repository URL].</w:t>
+        <w:t>The Global Findex Database 2025 is published by the World Bank at worldbank.org/globalfindex. All code producing every figure, table and statistic in this paper, together with the analysis notebook, is available at https://github.com/grgbkv/financial-inclusion-findex-2025.</w:t>
       </w:r>
     </w:p>
     <w:p>

</xml_diff>